<commit_message>
Add code and terminal screenshots to assignment 3 docs
</commit_message>
<xml_diff>
--- a/assignment_3/DOCUMENTATION.docx
+++ b/assignment_3/DOCUMENTATION.docx
@@ -748,7 +748,54 @@
         <w:rPr>
           <w:color w:val="2D6A4F"/>
         </w:rPr>
-        <w:t>5. Preview</w:t>
+        <w:t>5. Source Code</w:t>
+      </w:r>
+    </w:p>
+    <w:p>
+      <w:r>
+        <w:drawing>
+          <wp:inline xmlns:a="http://schemas.openxmlformats.org/drawingml/2006/main" xmlns:pic="http://schemas.openxmlformats.org/drawingml/2006/picture">
+            <wp:extent cx="5669280" cy="12642494"/>
+            <wp:docPr id="1" name="Picture 1"/>
+            <wp:cNvGraphicFramePr>
+              <a:graphicFrameLocks noChangeAspect="1"/>
+            </wp:cNvGraphicFramePr>
+            <a:graphic>
+              <a:graphicData uri="http://schemas.openxmlformats.org/drawingml/2006/picture">
+                <pic:pic>
+                  <pic:nvPicPr>
+                    <pic:cNvPr id="0" name="code_main.png"/>
+                    <pic:cNvPicPr/>
+                  </pic:nvPicPr>
+                  <pic:blipFill>
+                    <a:blip r:embed="rId9"/>
+                    <a:stretch>
+                      <a:fillRect/>
+                    </a:stretch>
+                  </pic:blipFill>
+                  <pic:spPr>
+                    <a:xfrm>
+                      <a:off x="0" y="0"/>
+                      <a:ext cx="5669280" cy="12642494"/>
+                    </a:xfrm>
+                    <a:prstGeom prst="rect"/>
+                  </pic:spPr>
+                </pic:pic>
+              </a:graphicData>
+            </a:graphic>
+          </wp:inline>
+        </w:drawing>
+      </w:r>
+    </w:p>
+    <w:p>
+      <w:pPr>
+        <w:pStyle w:val="Heading2"/>
+      </w:pPr>
+      <w:r>
+        <w:rPr>
+          <w:color w:val="2D6A4F"/>
+        </w:rPr>
+        <w:t>6. Layout Preview</w:t>
       </w:r>
     </w:p>
     <w:p>
@@ -756,7 +803,7 @@
         <w:drawing>
           <wp:inline xmlns:a="http://schemas.openxmlformats.org/drawingml/2006/main" xmlns:pic="http://schemas.openxmlformats.org/drawingml/2006/picture">
             <wp:extent cx="2377440" cy="5307773"/>
-            <wp:docPr id="1" name="Picture 1"/>
+            <wp:docPr id="2" name="Picture 2"/>
             <wp:cNvGraphicFramePr>
               <a:graphicFrameLocks noChangeAspect="1"/>
             </wp:cNvGraphicFramePr>
@@ -768,7 +815,7 @@
                     <pic:cNvPicPr/>
                   </pic:nvPicPr>
                   <pic:blipFill>
-                    <a:blip r:embed="rId9"/>
+                    <a:blip r:embed="rId10"/>
                     <a:stretch>
                       <a:fillRect/>
                     </a:stretch>
@@ -830,7 +877,54 @@
         <w:rPr>
           <w:color w:val="2D6A4F"/>
         </w:rPr>
-        <w:t>6. Run Instructions</w:t>
+        <w:t>7. Terminal</w:t>
+      </w:r>
+    </w:p>
+    <w:p>
+      <w:r>
+        <w:drawing>
+          <wp:inline xmlns:a="http://schemas.openxmlformats.org/drawingml/2006/main" xmlns:pic="http://schemas.openxmlformats.org/drawingml/2006/picture">
+            <wp:extent cx="5669280" cy="3276844"/>
+            <wp:docPr id="3" name="Picture 3"/>
+            <wp:cNvGraphicFramePr>
+              <a:graphicFrameLocks noChangeAspect="1"/>
+            </wp:cNvGraphicFramePr>
+            <a:graphic>
+              <a:graphicData uri="http://schemas.openxmlformats.org/drawingml/2006/picture">
+                <pic:pic>
+                  <pic:nvPicPr>
+                    <pic:cNvPr id="0" name="terminal.png"/>
+                    <pic:cNvPicPr/>
+                  </pic:nvPicPr>
+                  <pic:blipFill>
+                    <a:blip r:embed="rId11"/>
+                    <a:stretch>
+                      <a:fillRect/>
+                    </a:stretch>
+                  </pic:blipFill>
+                  <pic:spPr>
+                    <a:xfrm>
+                      <a:off x="0" y="0"/>
+                      <a:ext cx="5669280" cy="3276844"/>
+                    </a:xfrm>
+                    <a:prstGeom prst="rect"/>
+                  </pic:spPr>
+                </pic:pic>
+              </a:graphicData>
+            </a:graphic>
+          </wp:inline>
+        </w:drawing>
+      </w:r>
+    </w:p>
+    <w:p>
+      <w:pPr>
+        <w:pStyle w:val="Heading2"/>
+      </w:pPr>
+      <w:r>
+        <w:rPr>
+          <w:color w:val="2D6A4F"/>
+        </w:rPr>
+        <w:t>8. Run Instructions</w:t>
       </w:r>
     </w:p>
     <w:p>
@@ -857,7 +951,7 @@
         <w:rPr>
           <w:color w:val="2D6A4F"/>
         </w:rPr>
-        <w:t>7. Possible Extensions</w:t>
+        <w:t>9. Possible Extensions</w:t>
       </w:r>
     </w:p>
     <w:p>

</xml_diff>

<commit_message>
Run assignment 3 on real Flutter SDK: web build, real app screenshots at phone/desktop widths, real terminal capture
</commit_message>
<xml_diff>
--- a/assignment_3/DOCUMENTATION.docx
+++ b/assignment_3/DOCUMENTATION.docx
@@ -795,14 +795,40 @@
         <w:rPr>
           <w:color w:val="2D6A4F"/>
         </w:rPr>
-        <w:t>6. Layout Preview</w:t>
+        <w:t>6. App Screenshots</w:t>
+      </w:r>
+    </w:p>
+    <w:p>
+      <w:r>
+        <w:t>The app was built for the web (</w:t>
+      </w:r>
+      <w:r>
+        <w:rPr>
+          <w:rFonts w:ascii="Menlo" w:hAnsi="Menlo"/>
+          <w:sz w:val="19"/>
+        </w:rPr>
+        <w:t>flutter build web</w:t>
+      </w:r>
+      <w:r>
+        <w:t>) and captured in Chrome at two window sizes.</w:t>
+      </w:r>
+    </w:p>
+    <w:p>
+      <w:r>
+        <w:rPr>
+          <w:b/>
+        </w:rPr>
+        <w:t>Phone width (500px)</w:t>
+      </w:r>
+      <w:r>
+        <w:t xml:space="preserve"> — 2-column grid, sections stacked:</w:t>
       </w:r>
     </w:p>
     <w:p>
       <w:r>
         <w:drawing>
           <wp:inline xmlns:a="http://schemas.openxmlformats.org/drawingml/2006/main" xmlns:pic="http://schemas.openxmlformats.org/drawingml/2006/picture">
-            <wp:extent cx="2377440" cy="5307773"/>
+            <wp:extent cx="2194560" cy="4169664"/>
             <wp:docPr id="2" name="Picture 2"/>
             <wp:cNvGraphicFramePr>
               <a:graphicFrameLocks noChangeAspect="1"/>
@@ -823,7 +849,7 @@
                   <pic:spPr>
                     <a:xfrm>
                       <a:off x="0" y="0"/>
-                      <a:ext cx="2377440" cy="5307773"/>
+                      <a:ext cx="2194560" cy="4169664"/>
                     </a:xfrm>
                     <a:prstGeom prst="rect"/>
                   </pic:spPr>
@@ -836,37 +862,74 @@
     </w:p>
     <w:p>
       <w:r>
-        <w:t xml:space="preserve">The preview shows the narrow layout: summary chips on top (via </w:t>
+        <w:rPr>
+          <w:b/>
+        </w:rPr>
+        <w:t>Desktop width (1280px)</w:t>
+      </w:r>
+      <w:r>
+        <w:t xml:space="preserve"> — 4-column grid, activity panel beside the grid via </w:t>
       </w:r>
       <w:r>
         <w:rPr>
           <w:rFonts w:ascii="Menlo" w:hAnsi="Menlo"/>
           <w:sz w:val="19"/>
         </w:rPr>
-        <w:t>Expanded</w:t>
+        <w:t>Flexible</w:t>
       </w:r>
       <w:r>
-        <w:t xml:space="preserve">), a 2-column </w:t>
+        <w:t>:</w:t>
+      </w:r>
+    </w:p>
+    <w:p>
+      <w:r>
+        <w:drawing>
+          <wp:inline xmlns:a="http://schemas.openxmlformats.org/drawingml/2006/main" xmlns:pic="http://schemas.openxmlformats.org/drawingml/2006/picture">
+            <wp:extent cx="5669280" cy="3543300"/>
+            <wp:docPr id="3" name="Picture 3"/>
+            <wp:cNvGraphicFramePr>
+              <a:graphicFrameLocks noChangeAspect="1"/>
+            </wp:cNvGraphicFramePr>
+            <a:graphic>
+              <a:graphicData uri="http://schemas.openxmlformats.org/drawingml/2006/picture">
+                <pic:pic>
+                  <pic:nvPicPr>
+                    <pic:cNvPr id="0" name="screenshot_desktop.png"/>
+                    <pic:cNvPicPr/>
+                  </pic:nvPicPr>
+                  <pic:blipFill>
+                    <a:blip r:embed="rId11"/>
+                    <a:stretch>
+                      <a:fillRect/>
+                    </a:stretch>
+                  </pic:blipFill>
+                  <pic:spPr>
+                    <a:xfrm>
+                      <a:off x="0" y="0"/>
+                      <a:ext cx="5669280" cy="3543300"/>
+                    </a:xfrm>
+                    <a:prstGeom prst="rect"/>
+                  </pic:spPr>
+                </pic:pic>
+              </a:graphicData>
+            </a:graphic>
+          </wp:inline>
+        </w:drawing>
+      </w:r>
+    </w:p>
+    <w:p>
+      <w:r>
+        <w:t xml:space="preserve">The same code produces both layouts; only the </w:t>
       </w:r>
       <w:r>
         <w:rPr>
           <w:rFonts w:ascii="Menlo" w:hAnsi="Menlo"/>
           <w:sz w:val="19"/>
         </w:rPr>
-        <w:t>GridView</w:t>
+        <w:t>MediaQuery</w:t>
       </w:r>
       <w:r>
-        <w:t xml:space="preserve"> of stat cards, and the </w:t>
-      </w:r>
-      <w:r>
-        <w:rPr>
-          <w:rFonts w:ascii="Menlo" w:hAnsi="Menlo"/>
-          <w:sz w:val="19"/>
-        </w:rPr>
-        <w:t>ListView</w:t>
-      </w:r>
-      <w:r>
-        <w:t xml:space="preserve"> activity feed below.</w:t>
+        <w:t xml:space="preserve"> width decides.</w:t>
       </w:r>
     </w:p>
     <w:p>
@@ -882,10 +945,45 @@
     </w:p>
     <w:p>
       <w:r>
+        <w:t xml:space="preserve">Real build-and-run session: </w:t>
+      </w:r>
+      <w:r>
+        <w:rPr>
+          <w:rFonts w:ascii="Menlo" w:hAnsi="Menlo"/>
+          <w:sz w:val="19"/>
+        </w:rPr>
+        <w:t>flutter pub get</w:t>
+      </w:r>
+      <w:r>
+        <w:t xml:space="preserve">, </w:t>
+      </w:r>
+      <w:r>
+        <w:rPr>
+          <w:rFonts w:ascii="Menlo" w:hAnsi="Menlo"/>
+          <w:sz w:val="19"/>
+        </w:rPr>
+        <w:t>flutter analyze</w:t>
+      </w:r>
+      <w:r>
+        <w:t xml:space="preserve"> (no issues), </w:t>
+      </w:r>
+      <w:r>
+        <w:rPr>
+          <w:rFonts w:ascii="Menlo" w:hAnsi="Menlo"/>
+          <w:sz w:val="19"/>
+        </w:rPr>
+        <w:t>flutter build web</w:t>
+      </w:r>
+      <w:r>
+        <w:t>, then headless Chrome captures at both widths.</w:t>
+      </w:r>
+    </w:p>
+    <w:p>
+      <w:r>
         <w:drawing>
           <wp:inline xmlns:a="http://schemas.openxmlformats.org/drawingml/2006/main" xmlns:pic="http://schemas.openxmlformats.org/drawingml/2006/picture">
-            <wp:extent cx="5669280" cy="3276844"/>
-            <wp:docPr id="3" name="Picture 3"/>
+            <wp:extent cx="5669280" cy="3821095"/>
+            <wp:docPr id="4" name="Picture 4"/>
             <wp:cNvGraphicFramePr>
               <a:graphicFrameLocks noChangeAspect="1"/>
             </wp:cNvGraphicFramePr>
@@ -897,7 +995,7 @@
                     <pic:cNvPicPr/>
                   </pic:nvPicPr>
                   <pic:blipFill>
-                    <a:blip r:embed="rId11"/>
+                    <a:blip r:embed="rId12"/>
                     <a:stretch>
                       <a:fillRect/>
                     </a:stretch>
@@ -905,7 +1003,7 @@
                   <pic:spPr>
                     <a:xfrm>
                       <a:off x="0" y="0"/>
-                      <a:ext cx="5669280" cy="3276844"/>
+                      <a:ext cx="5669280" cy="3821095"/>
                     </a:xfrm>
                     <a:prstGeom prst="rect"/>
                   </pic:spPr>

</xml_diff>